<commit_message>
Record M1 sign-off — SRS v1.1 baselined, D-01..D-04 ratified
Co-Authored-By: Claude Fable 5 <noreply@anthropic.com>
</commit_message>
<xml_diff>
--- a/projects/kkn-badko-blog/export/kkn-badko-blog_Audit_Report.docx
+++ b/projects/kkn-badko-blog/export/kkn-badko-blog_Audit_Report.docx
@@ -129,7 +129,23 @@
         <w:t xml:space="preserve"> </w:t>
       </w:r>
       <w:r>
-        <w:t xml:space="preserve">— requirements baseline is sound; all open items GAP-01…05 are resolved (see §5 and SRS Appendix A). Decisions D-01…D-04 await formal stakeholder ratification at M1. No blocking defects.</w:t>
+        <w:t xml:space="preserve">— requirements baseline is sound; all open items GAP-01…05 are resolved (see §5 and SRS Appendix A). Decisions D-01…D-04 were</w:t>
+      </w:r>
+      <w:r>
+        <w:t xml:space="preserve"> </w:t>
+      </w:r>
+      <w:r>
+        <w:rPr>
+          <w:bCs/>
+          <w:b/>
+        </w:rPr>
+        <w:t xml:space="preserve">ratified at M1 sign-off on 2026-07-26</w:t>
+      </w:r>
+      <w:r>
+        <w:t xml:space="preserve"> </w:t>
+      </w:r>
+      <w:r>
+        <w:t xml:space="preserve">(SRS Appendix B); the baseline is frozen for Phase 2. No blocking defects.</w:t>
       </w:r>
     </w:p>
     <w:p>

</xml_diff>